<commit_message>
docs: agregar capturas de evidencia al documento del sistema
Cinco capturas que documentan una sesion completa: interfaz del CRUD,
respuesta JSON del backend, rechazo de monto negativo, contenedor MySQL
en Docker y persistencia tras recargar la pagina.

Se agrega el caso de persistencia a la tabla de pruebas y se incrustan
las figuras en el .docx con sus pies de foto.

Co-Authored-By: Claude Opus 5 <noreply@anthropic.com>
</commit_message>
<xml_diff>
--- a/MisProyectosPython/Proyecto_Completo/Documento_del_Sistema_Quantum_Core.docx
+++ b/MisProyectosPython/Proyecto_Completo/Documento_del_Sistema_Quantum_Core.docx
@@ -72,7 +72,7 @@
           <w:left w:w="10" w:type="dxa"/>
           <w:right w:w="10" w:type="dxa"/>
         </w:tblCellMar>
-        <w:tblLook w:val="04A0" w:firstRow="1" w:lastRow="0" w:firstColumn="1" w:lastColumn="0" w:noHBand="0" w:noVBand="1"/>
+        <w:tblLook w:val="0000" w:firstRow="0" w:lastRow="0" w:firstColumn="0" w:lastColumn="0" w:noHBand="0" w:noVBand="0"/>
       </w:tblPr>
       <w:tblGrid>
         <w:gridCol w:w="2434"/>
@@ -405,7 +405,7 @@
         </w:pBdr>
         <w:spacing w:before="360" w:after="160"/>
       </w:pPr>
-      <w:bookmarkStart w:id="0" w:name="_Toc236584345"/>
+      <w:bookmarkStart w:id="0" w:name="_Toc236586586"/>
       <w:r>
         <w:rPr>
           <w:b/>
@@ -421,7 +421,7 @@
     <w:sdt>
       <w:sdtPr>
         <w:alias w:val="Contenido"/>
-        <w:id w:val="1496756570"/>
+        <w:id w:val="1861005335"/>
       </w:sdtPr>
       <w:sdtEndPr/>
       <w:sdtContent>
@@ -449,7 +449,7 @@
           <w:r>
             <w:fldChar w:fldCharType="separate"/>
           </w:r>
-          <w:hyperlink w:anchor="_Toc236584345" w:history="1">
+          <w:hyperlink w:anchor="_Toc236586586" w:history="1">
             <w:r>
               <w:rPr>
                 <w:rStyle w:val="Hipervnculo"/>
@@ -475,7 +475,7 @@
               <w:rPr>
                 <w:noProof/>
               </w:rPr>
-              <w:instrText xml:space="preserve"> PAGEREF _Toc236584345 \h </w:instrText>
+              <w:instrText xml:space="preserve"> PAGEREF _Toc236586586 \h </w:instrText>
             </w:r>
             <w:r>
               <w:rPr>
@@ -517,7 +517,7 @@
               <w14:ligatures w14:val="standardContextual"/>
             </w:rPr>
           </w:pPr>
-          <w:hyperlink w:anchor="_Toc236584346" w:history="1">
+          <w:hyperlink w:anchor="_Toc236586587" w:history="1">
             <w:r>
               <w:rPr>
                 <w:rStyle w:val="Hipervnculo"/>
@@ -543,7 +543,7 @@
               <w:rPr>
                 <w:noProof/>
               </w:rPr>
-              <w:instrText xml:space="preserve"> PAGEREF _Toc236584346 \h </w:instrText>
+              <w:instrText xml:space="preserve"> PAGEREF _Toc236586587 \h </w:instrText>
             </w:r>
             <w:r>
               <w:rPr>
@@ -585,7 +585,7 @@
               <w14:ligatures w14:val="standardContextual"/>
             </w:rPr>
           </w:pPr>
-          <w:hyperlink w:anchor="_Toc236584347" w:history="1">
+          <w:hyperlink w:anchor="_Toc236586588" w:history="1">
             <w:r>
               <w:rPr>
                 <w:rStyle w:val="Hipervnculo"/>
@@ -611,7 +611,7 @@
               <w:rPr>
                 <w:noProof/>
               </w:rPr>
-              <w:instrText xml:space="preserve"> PAGEREF _Toc236584347 \h </w:instrText>
+              <w:instrText xml:space="preserve"> PAGEREF _Toc236586588 \h </w:instrText>
             </w:r>
             <w:r>
               <w:rPr>
@@ -653,7 +653,7 @@
               <w14:ligatures w14:val="standardContextual"/>
             </w:rPr>
           </w:pPr>
-          <w:hyperlink w:anchor="_Toc236584348" w:history="1">
+          <w:hyperlink w:anchor="_Toc236586589" w:history="1">
             <w:r>
               <w:rPr>
                 <w:rStyle w:val="Hipervnculo"/>
@@ -679,7 +679,7 @@
               <w:rPr>
                 <w:noProof/>
               </w:rPr>
-              <w:instrText xml:space="preserve"> PAGEREF _Toc236584348 \h </w:instrText>
+              <w:instrText xml:space="preserve"> PAGEREF _Toc236586589 \h </w:instrText>
             </w:r>
             <w:r>
               <w:rPr>
@@ -721,7 +721,7 @@
               <w14:ligatures w14:val="standardContextual"/>
             </w:rPr>
           </w:pPr>
-          <w:hyperlink w:anchor="_Toc236584349" w:history="1">
+          <w:hyperlink w:anchor="_Toc236586590" w:history="1">
             <w:r>
               <w:rPr>
                 <w:rStyle w:val="Hipervnculo"/>
@@ -747,7 +747,7 @@
               <w:rPr>
                 <w:noProof/>
               </w:rPr>
-              <w:instrText xml:space="preserve"> PAGEREF _Toc236584349 \h </w:instrText>
+              <w:instrText xml:space="preserve"> PAGEREF _Toc236586590 \h </w:instrText>
             </w:r>
             <w:r>
               <w:rPr>
@@ -789,7 +789,7 @@
               <w14:ligatures w14:val="standardContextual"/>
             </w:rPr>
           </w:pPr>
-          <w:hyperlink w:anchor="_Toc236584350" w:history="1">
+          <w:hyperlink w:anchor="_Toc236586591" w:history="1">
             <w:r>
               <w:rPr>
                 <w:rStyle w:val="Hipervnculo"/>
@@ -815,7 +815,7 @@
               <w:rPr>
                 <w:noProof/>
               </w:rPr>
-              <w:instrText xml:space="preserve"> PAGEREF _Toc236584350 \h </w:instrText>
+              <w:instrText xml:space="preserve"> PAGEREF _Toc236586591 \h </w:instrText>
             </w:r>
             <w:r>
               <w:rPr>
@@ -857,7 +857,7 @@
               <w14:ligatures w14:val="standardContextual"/>
             </w:rPr>
           </w:pPr>
-          <w:hyperlink w:anchor="_Toc236584351" w:history="1">
+          <w:hyperlink w:anchor="_Toc236586592" w:history="1">
             <w:r>
               <w:rPr>
                 <w:rStyle w:val="Hipervnculo"/>
@@ -883,7 +883,7 @@
               <w:rPr>
                 <w:noProof/>
               </w:rPr>
-              <w:instrText xml:space="preserve"> PAGEREF _Toc236584351 \h </w:instrText>
+              <w:instrText xml:space="preserve"> PAGEREF _Toc236586592 \h </w:instrText>
             </w:r>
             <w:r>
               <w:rPr>
@@ -925,7 +925,7 @@
               <w14:ligatures w14:val="standardContextual"/>
             </w:rPr>
           </w:pPr>
-          <w:hyperlink w:anchor="_Toc236584352" w:history="1">
+          <w:hyperlink w:anchor="_Toc236586593" w:history="1">
             <w:r>
               <w:rPr>
                 <w:rStyle w:val="Hipervnculo"/>
@@ -951,7 +951,7 @@
               <w:rPr>
                 <w:noProof/>
               </w:rPr>
-              <w:instrText xml:space="preserve"> PAGEREF _Toc236584352 \h </w:instrText>
+              <w:instrText xml:space="preserve"> PAGEREF _Toc236586593 \h </w:instrText>
             </w:r>
             <w:r>
               <w:rPr>
@@ -993,7 +993,7 @@
               <w14:ligatures w14:val="standardContextual"/>
             </w:rPr>
           </w:pPr>
-          <w:hyperlink w:anchor="_Toc236584353" w:history="1">
+          <w:hyperlink w:anchor="_Toc236586594" w:history="1">
             <w:r>
               <w:rPr>
                 <w:rStyle w:val="Hipervnculo"/>
@@ -1019,7 +1019,7 @@
               <w:rPr>
                 <w:noProof/>
               </w:rPr>
-              <w:instrText xml:space="preserve"> PAGEREF _Toc236584353 \h </w:instrText>
+              <w:instrText xml:space="preserve"> PAGEREF _Toc236586594 \h </w:instrText>
             </w:r>
             <w:r>
               <w:rPr>
@@ -1061,7 +1061,7 @@
               <w14:ligatures w14:val="standardContextual"/>
             </w:rPr>
           </w:pPr>
-          <w:hyperlink w:anchor="_Toc236584354" w:history="1">
+          <w:hyperlink w:anchor="_Toc236586595" w:history="1">
             <w:r>
               <w:rPr>
                 <w:rStyle w:val="Hipervnculo"/>
@@ -1087,7 +1087,7 @@
               <w:rPr>
                 <w:noProof/>
               </w:rPr>
-              <w:instrText xml:space="preserve"> PAGEREF _Toc236584354 \h </w:instrText>
+              <w:instrText xml:space="preserve"> PAGEREF _Toc236586595 \h </w:instrText>
             </w:r>
             <w:r>
               <w:rPr>
@@ -1129,7 +1129,7 @@
               <w14:ligatures w14:val="standardContextual"/>
             </w:rPr>
           </w:pPr>
-          <w:hyperlink w:anchor="_Toc236584355" w:history="1">
+          <w:hyperlink w:anchor="_Toc236586596" w:history="1">
             <w:r>
               <w:rPr>
                 <w:rStyle w:val="Hipervnculo"/>
@@ -1155,7 +1155,7 @@
               <w:rPr>
                 <w:noProof/>
               </w:rPr>
-              <w:instrText xml:space="preserve"> PAGEREF _Toc236584355 \h </w:instrText>
+              <w:instrText xml:space="preserve"> PAGEREF _Toc236586596 \h </w:instrText>
             </w:r>
             <w:r>
               <w:rPr>
@@ -1197,7 +1197,7 @@
               <w14:ligatures w14:val="standardContextual"/>
             </w:rPr>
           </w:pPr>
-          <w:hyperlink w:anchor="_Toc236584356" w:history="1">
+          <w:hyperlink w:anchor="_Toc236586597" w:history="1">
             <w:r>
               <w:rPr>
                 <w:rStyle w:val="Hipervnculo"/>
@@ -1223,7 +1223,7 @@
               <w:rPr>
                 <w:noProof/>
               </w:rPr>
-              <w:instrText xml:space="preserve"> PAGEREF _Toc236584356 \h </w:instrText>
+              <w:instrText xml:space="preserve"> PAGEREF _Toc236586597 \h </w:instrText>
             </w:r>
             <w:r>
               <w:rPr>
@@ -1265,7 +1265,7 @@
               <w14:ligatures w14:val="standardContextual"/>
             </w:rPr>
           </w:pPr>
-          <w:hyperlink w:anchor="_Toc236584357" w:history="1">
+          <w:hyperlink w:anchor="_Toc236586598" w:history="1">
             <w:r>
               <w:rPr>
                 <w:rStyle w:val="Hipervnculo"/>
@@ -1291,7 +1291,7 @@
               <w:rPr>
                 <w:noProof/>
               </w:rPr>
-              <w:instrText xml:space="preserve"> PAGEREF _Toc236584357 \h </w:instrText>
+              <w:instrText xml:space="preserve"> PAGEREF _Toc236586598 \h </w:instrText>
             </w:r>
             <w:r>
               <w:rPr>
@@ -1333,7 +1333,7 @@
               <w14:ligatures w14:val="standardContextual"/>
             </w:rPr>
           </w:pPr>
-          <w:hyperlink w:anchor="_Toc236584358" w:history="1">
+          <w:hyperlink w:anchor="_Toc236586599" w:history="1">
             <w:r>
               <w:rPr>
                 <w:rStyle w:val="Hipervnculo"/>
@@ -1359,7 +1359,7 @@
               <w:rPr>
                 <w:noProof/>
               </w:rPr>
-              <w:instrText xml:space="preserve"> PAGEREF _Toc236584358 \h </w:instrText>
+              <w:instrText xml:space="preserve"> PAGEREF _Toc236586599 \h </w:instrText>
             </w:r>
             <w:r>
               <w:rPr>
@@ -1401,7 +1401,7 @@
               <w14:ligatures w14:val="standardContextual"/>
             </w:rPr>
           </w:pPr>
-          <w:hyperlink w:anchor="_Toc236584359" w:history="1">
+          <w:hyperlink w:anchor="_Toc236586600" w:history="1">
             <w:r>
               <w:rPr>
                 <w:rStyle w:val="Hipervnculo"/>
@@ -1427,7 +1427,7 @@
               <w:rPr>
                 <w:noProof/>
               </w:rPr>
-              <w:instrText xml:space="preserve"> PAGEREF _Toc236584359 \h </w:instrText>
+              <w:instrText xml:space="preserve"> PAGEREF _Toc236586600 \h </w:instrText>
             </w:r>
             <w:r>
               <w:rPr>
@@ -1469,7 +1469,7 @@
               <w14:ligatures w14:val="standardContextual"/>
             </w:rPr>
           </w:pPr>
-          <w:hyperlink w:anchor="_Toc236584360" w:history="1">
+          <w:hyperlink w:anchor="_Toc236586601" w:history="1">
             <w:r>
               <w:rPr>
                 <w:rStyle w:val="Hipervnculo"/>
@@ -1495,7 +1495,7 @@
               <w:rPr>
                 <w:noProof/>
               </w:rPr>
-              <w:instrText xml:space="preserve"> PAGEREF _Toc236584360 \h </w:instrText>
+              <w:instrText xml:space="preserve"> PAGEREF _Toc236586601 \h </w:instrText>
             </w:r>
             <w:r>
               <w:rPr>
@@ -1537,7 +1537,7 @@
               <w14:ligatures w14:val="standardContextual"/>
             </w:rPr>
           </w:pPr>
-          <w:hyperlink w:anchor="_Toc236584361" w:history="1">
+          <w:hyperlink w:anchor="_Toc236586602" w:history="1">
             <w:r>
               <w:rPr>
                 <w:rStyle w:val="Hipervnculo"/>
@@ -1563,7 +1563,75 @@
               <w:rPr>
                 <w:noProof/>
               </w:rPr>
-              <w:instrText xml:space="preserve"> PAGEREF _Toc236584361 \h </w:instrText>
+              <w:instrText xml:space="preserve"> PAGEREF _Toc236586602 \h </w:instrText>
+            </w:r>
+            <w:r>
+              <w:rPr>
+                <w:noProof/>
+              </w:rPr>
+            </w:r>
+            <w:r>
+              <w:rPr>
+                <w:noProof/>
+              </w:rPr>
+              <w:fldChar w:fldCharType="separate"/>
+            </w:r>
+            <w:r>
+              <w:rPr>
+                <w:noProof/>
+              </w:rPr>
+              <w:t>7</w:t>
+            </w:r>
+            <w:r>
+              <w:rPr>
+                <w:noProof/>
+              </w:rPr>
+              <w:fldChar w:fldCharType="end"/>
+            </w:r>
+          </w:hyperlink>
+        </w:p>
+        <w:p>
+          <w:pPr>
+            <w:pStyle w:val="TDC2"/>
+            <w:tabs>
+              <w:tab w:val="right" w:leader="dot" w:pos="9350"/>
+            </w:tabs>
+            <w:rPr>
+              <w:rFonts w:asciiTheme="minorHAnsi" w:eastAsiaTheme="minorEastAsia" w:hAnsiTheme="minorHAnsi" w:cstheme="minorBidi"/>
+              <w:noProof/>
+              <w:kern w:val="2"/>
+              <w:sz w:val="24"/>
+              <w:szCs w:val="24"/>
+              <w14:ligatures w14:val="standardContextual"/>
+            </w:rPr>
+          </w:pPr>
+          <w:hyperlink w:anchor="_Toc236586603" w:history="1">
+            <w:r>
+              <w:rPr>
+                <w:rStyle w:val="Hipervnculo"/>
+                <w:b/>
+                <w:bCs/>
+                <w:noProof/>
+              </w:rPr>
+              <w:t>Capturas de pantalla</w:t>
+            </w:r>
+            <w:r>
+              <w:rPr>
+                <w:noProof/>
+              </w:rPr>
+              <w:tab/>
+            </w:r>
+            <w:r>
+              <w:rPr>
+                <w:noProof/>
+              </w:rPr>
+              <w:fldChar w:fldCharType="begin"/>
+            </w:r>
+            <w:r>
+              <w:rPr>
+                <w:noProof/>
+              </w:rPr>
+              <w:instrText xml:space="preserve"> PAGEREF _Toc236586603 \h </w:instrText>
             </w:r>
             <w:r>
               <w:rPr>
@@ -1605,7 +1673,7 @@
               <w14:ligatures w14:val="standardContextual"/>
             </w:rPr>
           </w:pPr>
-          <w:hyperlink w:anchor="_Toc236584362" w:history="1">
+          <w:hyperlink w:anchor="_Toc236586604" w:history="1">
             <w:r>
               <w:rPr>
                 <w:rStyle w:val="Hipervnculo"/>
@@ -1631,7 +1699,7 @@
               <w:rPr>
                 <w:noProof/>
               </w:rPr>
-              <w:instrText xml:space="preserve"> PAGEREF _Toc236584362 \h </w:instrText>
+              <w:instrText xml:space="preserve"> PAGEREF _Toc236586604 \h </w:instrText>
             </w:r>
             <w:r>
               <w:rPr>
@@ -1648,7 +1716,7 @@
               <w:rPr>
                 <w:noProof/>
               </w:rPr>
-              <w:t>7</w:t>
+              <w:t>10</w:t>
             </w:r>
             <w:r>
               <w:rPr>
@@ -1673,7 +1741,7 @@
               <w14:ligatures w14:val="standardContextual"/>
             </w:rPr>
           </w:pPr>
-          <w:hyperlink w:anchor="_Toc236584363" w:history="1">
+          <w:hyperlink w:anchor="_Toc236586605" w:history="1">
             <w:r>
               <w:rPr>
                 <w:rStyle w:val="Hipervnculo"/>
@@ -1699,7 +1767,7 @@
               <w:rPr>
                 <w:noProof/>
               </w:rPr>
-              <w:instrText xml:space="preserve"> PAGEREF _Toc236584363 \h </w:instrText>
+              <w:instrText xml:space="preserve"> PAGEREF _Toc236586605 \h </w:instrText>
             </w:r>
             <w:r>
               <w:rPr>
@@ -1716,7 +1784,7 @@
               <w:rPr>
                 <w:noProof/>
               </w:rPr>
-              <w:t>8</w:t>
+              <w:t>11</w:t>
             </w:r>
             <w:r>
               <w:rPr>
@@ -1746,7 +1814,7 @@
         </w:pBdr>
         <w:spacing w:before="360" w:after="160"/>
       </w:pPr>
-      <w:bookmarkStart w:id="1" w:name="_Toc236584346"/>
+      <w:bookmarkStart w:id="1" w:name="_Toc236586587"/>
       <w:r>
         <w:rPr>
           <w:b/>
@@ -1792,7 +1860,7 @@
         <w:pStyle w:val="Ttulo2"/>
         <w:spacing w:before="260" w:after="120"/>
       </w:pPr>
-      <w:bookmarkStart w:id="2" w:name="_Toc236584347"/>
+      <w:bookmarkStart w:id="2" w:name="_Toc236586588"/>
       <w:r>
         <w:rPr>
           <w:b/>
@@ -1820,7 +1888,7 @@
           <w:left w:w="10" w:type="dxa"/>
           <w:right w:w="10" w:type="dxa"/>
         </w:tblCellMar>
-        <w:tblLook w:val="04A0" w:firstRow="1" w:lastRow="0" w:firstColumn="1" w:lastColumn="0" w:noHBand="0" w:noVBand="1"/>
+        <w:tblLook w:val="0000" w:firstRow="0" w:lastRow="0" w:firstColumn="0" w:lastColumn="0" w:noHBand="0" w:noVBand="0"/>
       </w:tblPr>
       <w:tblGrid>
         <w:gridCol w:w="2246"/>
@@ -2153,7 +2221,7 @@
         </w:pBdr>
         <w:spacing w:before="360" w:after="160"/>
       </w:pPr>
-      <w:bookmarkStart w:id="3" w:name="_Toc236584348"/>
+      <w:bookmarkStart w:id="3" w:name="_Toc236586589"/>
       <w:r>
         <w:rPr>
           <w:b/>
@@ -2326,7 +2394,7 @@
         <w:pStyle w:val="Ttulo2"/>
         <w:spacing w:before="260" w:after="120"/>
       </w:pPr>
-      <w:bookmarkStart w:id="4" w:name="_Toc236584349"/>
+      <w:bookmarkStart w:id="4" w:name="_Toc236586590"/>
       <w:r>
         <w:rPr>
           <w:b/>
@@ -2384,7 +2452,7 @@
           <w:left w:w="10" w:type="dxa"/>
           <w:right w:w="10" w:type="dxa"/>
         </w:tblCellMar>
-        <w:tblLook w:val="04A0" w:firstRow="1" w:lastRow="0" w:firstColumn="1" w:lastColumn="0" w:noHBand="0" w:noVBand="1"/>
+        <w:tblLook w:val="0000" w:firstRow="0" w:lastRow="0" w:firstColumn="0" w:lastColumn="0" w:noHBand="0" w:noVBand="0"/>
       </w:tblPr>
       <w:tblGrid>
         <w:gridCol w:w="3744"/>
@@ -2609,7 +2677,7 @@
         <w:pStyle w:val="Ttulo2"/>
         <w:spacing w:before="260" w:after="120"/>
       </w:pPr>
-      <w:bookmarkStart w:id="5" w:name="_Toc236584350"/>
+      <w:bookmarkStart w:id="5" w:name="_Toc236586591"/>
       <w:r>
         <w:rPr>
           <w:b/>
@@ -2645,7 +2713,7 @@
           <w:left w:w="10" w:type="dxa"/>
           <w:right w:w="10" w:type="dxa"/>
         </w:tblCellMar>
-        <w:tblLook w:val="04A0" w:firstRow="1" w:lastRow="0" w:firstColumn="1" w:lastColumn="0" w:noHBand="0" w:noVBand="1"/>
+        <w:tblLook w:val="0000" w:firstRow="0" w:lastRow="0" w:firstColumn="0" w:lastColumn="0" w:noHBand="0" w:noVBand="0"/>
       </w:tblPr>
       <w:tblGrid>
         <w:gridCol w:w="1559"/>
@@ -3021,7 +3089,7 @@
         <w:pStyle w:val="Ttulo2"/>
         <w:spacing w:before="260" w:after="120"/>
       </w:pPr>
-      <w:bookmarkStart w:id="6" w:name="_Toc236584351"/>
+      <w:bookmarkStart w:id="6" w:name="_Toc236586592"/>
       <w:r>
         <w:rPr>
           <w:b/>
@@ -3092,7 +3160,7 @@
         </w:pBdr>
         <w:spacing w:before="360" w:after="160"/>
       </w:pPr>
-      <w:bookmarkStart w:id="7" w:name="_Toc236584352"/>
+      <w:bookmarkStart w:id="7" w:name="_Toc236586593"/>
       <w:r>
         <w:rPr>
           <w:b/>
@@ -3269,7 +3337,7 @@
           <w:left w:w="10" w:type="dxa"/>
           <w:right w:w="10" w:type="dxa"/>
         </w:tblCellMar>
-        <w:tblLook w:val="04A0" w:firstRow="1" w:lastRow="0" w:firstColumn="1" w:lastColumn="0" w:noHBand="0" w:noVBand="1"/>
+        <w:tblLook w:val="0000" w:firstRow="0" w:lastRow="0" w:firstColumn="0" w:lastColumn="0" w:noHBand="0" w:noVBand="0"/>
       </w:tblPr>
       <w:tblGrid>
         <w:gridCol w:w="1498"/>
@@ -3888,7 +3956,7 @@
         </w:pBdr>
         <w:spacing w:before="360" w:after="160"/>
       </w:pPr>
-      <w:bookmarkStart w:id="8" w:name="_Toc236584353"/>
+      <w:bookmarkStart w:id="8" w:name="_Toc236586594"/>
       <w:r>
         <w:rPr>
           <w:b/>
@@ -3933,7 +4001,7 @@
           <w:left w:w="10" w:type="dxa"/>
           <w:right w:w="10" w:type="dxa"/>
         </w:tblCellMar>
-        <w:tblLook w:val="04A0" w:firstRow="1" w:lastRow="0" w:firstColumn="1" w:lastColumn="0" w:noHBand="0" w:noVBand="1"/>
+        <w:tblLook w:val="0000" w:firstRow="0" w:lastRow="0" w:firstColumn="0" w:lastColumn="0" w:noHBand="0" w:noVBand="0"/>
       </w:tblPr>
       <w:tblGrid>
         <w:gridCol w:w="1404"/>
@@ -4527,7 +4595,7 @@
         <w:pStyle w:val="Ttulo2"/>
         <w:spacing w:before="260" w:after="120"/>
       </w:pPr>
-      <w:bookmarkStart w:id="9" w:name="_Toc236584354"/>
+      <w:bookmarkStart w:id="9" w:name="_Toc236586595"/>
       <w:r>
         <w:rPr>
           <w:b/>
@@ -4585,7 +4653,7 @@
           <w:left w:w="10" w:type="dxa"/>
           <w:right w:w="10" w:type="dxa"/>
         </w:tblCellMar>
-        <w:tblLook w:val="04A0" w:firstRow="1" w:lastRow="0" w:firstColumn="1" w:lastColumn="0" w:noHBand="0" w:noVBand="1"/>
+        <w:tblLook w:val="0000" w:firstRow="0" w:lastRow="0" w:firstColumn="0" w:lastColumn="0" w:noHBand="0" w:noVBand="0"/>
       </w:tblPr>
       <w:tblGrid>
         <w:gridCol w:w="2808"/>
@@ -4902,7 +4970,7 @@
         </w:pBdr>
         <w:spacing w:before="360" w:after="160"/>
       </w:pPr>
-      <w:bookmarkStart w:id="10" w:name="_Toc236584355"/>
+      <w:bookmarkStart w:id="10" w:name="_Toc236586596"/>
       <w:r>
         <w:rPr>
           <w:b/>
@@ -4930,7 +4998,7 @@
           <w:left w:w="10" w:type="dxa"/>
           <w:right w:w="10" w:type="dxa"/>
         </w:tblCellMar>
-        <w:tblLook w:val="04A0" w:firstRow="1" w:lastRow="0" w:firstColumn="1" w:lastColumn="0" w:noHBand="0" w:noVBand="1"/>
+        <w:tblLook w:val="0000" w:firstRow="0" w:lastRow="0" w:firstColumn="0" w:lastColumn="0" w:noHBand="0" w:noVBand="0"/>
       </w:tblPr>
       <w:tblGrid>
         <w:gridCol w:w="2808"/>
@@ -5749,7 +5817,7 @@
         </w:pBdr>
         <w:spacing w:before="360" w:after="160"/>
       </w:pPr>
-      <w:bookmarkStart w:id="11" w:name="_Toc236584356"/>
+      <w:bookmarkStart w:id="11" w:name="_Toc236586597"/>
       <w:r>
         <w:rPr>
           <w:b/>
@@ -5767,7 +5835,7 @@
         <w:pStyle w:val="Ttulo2"/>
         <w:spacing w:before="260" w:after="120"/>
       </w:pPr>
-      <w:bookmarkStart w:id="12" w:name="_Toc236584357"/>
+      <w:bookmarkStart w:id="12" w:name="_Toc236586598"/>
       <w:r>
         <w:rPr>
           <w:b/>
@@ -5829,7 +5897,7 @@
         <w:pStyle w:val="Ttulo2"/>
         <w:spacing w:before="260" w:after="120"/>
       </w:pPr>
-      <w:bookmarkStart w:id="13" w:name="_Toc236584358"/>
+      <w:bookmarkStart w:id="13" w:name="_Toc236586599"/>
       <w:r>
         <w:rPr>
           <w:b/>
@@ -5916,7 +5984,7 @@
         <w:pStyle w:val="Ttulo2"/>
         <w:spacing w:before="260" w:after="120"/>
       </w:pPr>
-      <w:bookmarkStart w:id="14" w:name="_Toc236584359"/>
+      <w:bookmarkStart w:id="14" w:name="_Toc236586600"/>
       <w:r>
         <w:rPr>
           <w:b/>
@@ -6192,7 +6260,7 @@
         <w:pStyle w:val="Ttulo2"/>
         <w:spacing w:before="260" w:after="120"/>
       </w:pPr>
-      <w:bookmarkStart w:id="15" w:name="_Toc236584360"/>
+      <w:bookmarkStart w:id="15" w:name="_Toc236586601"/>
       <w:r>
         <w:rPr>
           <w:b/>
@@ -6260,7 +6328,7 @@
         </w:pBdr>
         <w:spacing w:before="360" w:after="160"/>
       </w:pPr>
-      <w:bookmarkStart w:id="16" w:name="_Toc236584361"/>
+      <w:bookmarkStart w:id="16" w:name="_Toc236586602"/>
       <w:r>
         <w:rPr>
           <w:b/>
@@ -6482,7 +6550,7 @@
           <w:left w:w="10" w:type="dxa"/>
           <w:right w:w="10" w:type="dxa"/>
         </w:tblCellMar>
-        <w:tblLook w:val="04A0" w:firstRow="1" w:lastRow="0" w:firstColumn="1" w:lastColumn="0" w:noHBand="0" w:noVBand="1"/>
+        <w:tblLook w:val="0000" w:firstRow="0" w:lastRow="0" w:firstColumn="0" w:lastColumn="0" w:noHBand="0" w:noVBand="0"/>
       </w:tblPr>
       <w:tblGrid>
         <w:gridCol w:w="4118"/>
@@ -6803,6 +6871,85 @@
           </w:p>
         </w:tc>
       </w:tr>
+      <w:tr>
+        <w:tblPrEx>
+          <w:tblCellMar>
+            <w:top w:w="0" w:type="dxa"/>
+            <w:bottom w:w="0" w:type="dxa"/>
+          </w:tblCellMar>
+        </w:tblPrEx>
+        <w:tc>
+          <w:tcPr>
+            <w:tcW w:w="4118" w:type="dxa"/>
+            <w:shd w:val="clear" w:color="auto" w:fill="DBEAFE"/>
+            <w:tcMar>
+              <w:top w:w="60" w:type="dxa"/>
+              <w:left w:w="110" w:type="dxa"/>
+              <w:bottom w:w="60" w:type="dxa"/>
+              <w:right w:w="110" w:type="dxa"/>
+            </w:tcMar>
+          </w:tcPr>
+          <w:p>
+            <w:r>
+              <w:rPr>
+                <w:rFonts w:ascii="Consolas" w:eastAsia="Consolas" w:hAnsi="Consolas" w:cs="Consolas"/>
+                <w:sz w:val="19"/>
+                <w:szCs w:val="19"/>
+              </w:rPr>
+              <w:t>Crear T005 y recargar la página</w:t>
+            </w:r>
+          </w:p>
+        </w:tc>
+        <w:tc>
+          <w:tcPr>
+            <w:tcW w:w="2621" w:type="dxa"/>
+            <w:shd w:val="clear" w:color="auto" w:fill="DBEAFE"/>
+            <w:tcMar>
+              <w:top w:w="60" w:type="dxa"/>
+              <w:left w:w="110" w:type="dxa"/>
+              <w:bottom w:w="60" w:type="dxa"/>
+              <w:right w:w="110" w:type="dxa"/>
+            </w:tcMar>
+          </w:tcPr>
+          <w:p>
+            <w:r>
+              <w:rPr>
+                <w:sz w:val="21"/>
+                <w:szCs w:val="21"/>
+              </w:rPr>
+              <w:t>El dato sobrevive</w:t>
+            </w:r>
+          </w:p>
+        </w:tc>
+        <w:tc>
+          <w:tcPr>
+            <w:tcW w:w="2621" w:type="dxa"/>
+            <w:shd w:val="clear" w:color="auto" w:fill="DBEAFE"/>
+            <w:tcMar>
+              <w:top w:w="60" w:type="dxa"/>
+              <w:left w:w="110" w:type="dxa"/>
+              <w:bottom w:w="60" w:type="dxa"/>
+              <w:right w:w="110" w:type="dxa"/>
+            </w:tcMar>
+          </w:tcPr>
+          <w:p>
+            <w:r>
+              <w:rPr>
+                <w:sz w:val="21"/>
+                <w:szCs w:val="21"/>
+              </w:rPr>
+              <w:t>✔</w:t>
+            </w:r>
+            <w:r>
+              <w:rPr>
+                <w:sz w:val="21"/>
+                <w:szCs w:val="21"/>
+              </w:rPr>
+              <w:t xml:space="preserve"> Persiste</w:t>
+            </w:r>
+          </w:p>
+        </w:tc>
+      </w:tr>
     </w:tbl>
     <w:p>
       <w:pPr>
@@ -6814,7 +6961,7 @@
         <w:spacing w:after="120" w:line="276" w:lineRule="auto"/>
       </w:pPr>
       <w:r>
-        <w:t xml:space="preserve">En los tres casos el servidor respondió con el código correcto y </w:t>
+        <w:t xml:space="preserve">En los tres primeros casos el servidor respondió con el código correcto y </w:t>
       </w:r>
       <w:r>
         <w:rPr>
@@ -6829,22 +6976,398 @@
     </w:p>
     <w:p>
       <w:pPr>
+        <w:pStyle w:val="Ttulo2"/>
+        <w:spacing w:before="260" w:after="120"/>
+      </w:pPr>
+      <w:bookmarkStart w:id="17" w:name="_Toc236586603"/>
+      <w:r>
+        <w:rPr>
+          <w:b/>
+          <w:bCs/>
+          <w:color w:val="1E3A8A"/>
+          <w:sz w:val="25"/>
+          <w:szCs w:val="25"/>
+        </w:rPr>
+        <w:t>Capturas de pantalla</w:t>
+      </w:r>
+      <w:bookmarkEnd w:id="17"/>
+    </w:p>
+    <w:p>
+      <w:pPr>
+        <w:spacing w:after="120" w:line="276" w:lineRule="auto"/>
+      </w:pPr>
+      <w:r>
+        <w:t>Las siguientes capturas documentan una sesión completa del sistema, en orden cronológico.</w:t>
+      </w:r>
+    </w:p>
+    <w:p>
+      <w:pPr>
+        <w:keepNext/>
+        <w:keepLines/>
+        <w:spacing w:before="220" w:after="100" w:line="276" w:lineRule="auto"/>
+      </w:pPr>
+      <w:r>
+        <w:rPr>
+          <w:b/>
+          <w:bCs/>
+          <w:color w:val="1E3A8A"/>
+        </w:rPr>
+        <w:t xml:space="preserve">Figura 1 — Interfaz del CRUD. </w:t>
+      </w:r>
+      <w:r>
+        <w:t>Estado inicial: las cuatro transacciones migradas en la Semana 3, renderizadas por React tras consultar la API.</w:t>
+      </w:r>
+    </w:p>
+    <w:p>
+      <w:pPr>
+        <w:keepLines/>
         <w:pBdr>
-          <w:left w:val="single" w:sz="12" w:space="6" w:color="D99A00"/>
+          <w:top w:val="single" w:sz="4" w:space="4" w:color="C7D2E0"/>
+          <w:left w:val="single" w:sz="4" w:space="4" w:color="C7D2E0"/>
+          <w:bottom w:val="single" w:sz="4" w:space="4" w:color="C7D2E0"/>
+          <w:right w:val="single" w:sz="4" w:space="4" w:color="C7D2E0"/>
         </w:pBdr>
-        <w:shd w:val="clear" w:color="auto" w:fill="FFF7E6"/>
-        <w:spacing w:before="100" w:after="160" w:line="276" w:lineRule="auto"/>
-        <w:ind w:left="120"/>
-      </w:pPr>
-      <w:r>
-        <w:rPr>
-          <w:i/>
-          <w:iCs/>
-          <w:color w:val="6B4E00"/>
-          <w:sz w:val="21"/>
-          <w:szCs w:val="21"/>
-        </w:rPr>
-        <w:t>Se recomienda adjuntar capturas de pantalla de: la tabla en el navegador, la respuesta JSON del backend, el mensaje de error al intentar un monto negativo, y el contenedor activo en Docker Desktop.</w:t>
+        <w:spacing w:after="200"/>
+        <w:jc w:val="center"/>
+      </w:pPr>
+      <w:r>
+        <w:rPr>
+          <w:noProof/>
+        </w:rPr>
+        <w:drawing>
+          <wp:inline distT="0" distB="0" distL="0" distR="0" wp14:anchorId="4196B896" wp14:editId="4E342763">
+            <wp:extent cx="5715000" cy="2876550"/>
+            <wp:effectExtent l="0" t="0" r="0" b="0"/>
+            <wp:docPr id="1" name="Imagen 1"/>
+            <wp:cNvGraphicFramePr>
+              <a:graphicFrameLocks xmlns:a="http://schemas.openxmlformats.org/drawingml/2006/main" noChangeAspect="1"/>
+            </wp:cNvGraphicFramePr>
+            <a:graphic xmlns:a="http://schemas.openxmlformats.org/drawingml/2006/main">
+              <a:graphicData uri="http://schemas.openxmlformats.org/drawingml/2006/picture">
+                <pic:pic xmlns:pic="http://schemas.openxmlformats.org/drawingml/2006/picture">
+                  <pic:nvPicPr>
+                    <pic:cNvPr id="0" name=""/>
+                    <pic:cNvPicPr>
+                      <a:picLocks noChangeAspect="1" noChangeArrowheads="1"/>
+                    </pic:cNvPicPr>
+                  </pic:nvPicPr>
+                  <pic:blipFill>
+                    <a:blip r:embed="rId5"/>
+                    <a:srcRect/>
+                    <a:stretch>
+                      <a:fillRect/>
+                    </a:stretch>
+                  </pic:blipFill>
+                  <pic:spPr bwMode="auto">
+                    <a:xfrm>
+                      <a:off x="0" y="0"/>
+                      <a:ext cx="5715000" cy="2876550"/>
+                    </a:xfrm>
+                    <a:prstGeom prst="rect">
+                      <a:avLst/>
+                    </a:prstGeom>
+                  </pic:spPr>
+                </pic:pic>
+              </a:graphicData>
+            </a:graphic>
+          </wp:inline>
+        </w:drawing>
+      </w:r>
+    </w:p>
+    <w:p>
+      <w:pPr>
+        <w:keepNext/>
+        <w:keepLines/>
+        <w:spacing w:before="220" w:after="100" w:line="276" w:lineRule="auto"/>
+      </w:pPr>
+      <w:r>
+        <w:rPr>
+          <w:b/>
+          <w:bCs/>
+          <w:color w:val="1E3A8A"/>
+        </w:rPr>
+        <w:t xml:space="preserve">Figura 2 — Respuesta JSON del backend. </w:t>
+      </w:r>
+      <w:r>
+        <w:t>La misma información, consultada directamente al servidor Flask en el puerto 5000. Demuestra que el backend es un proceso independiente que expone JSON, sin intervención del frontend.</w:t>
+      </w:r>
+    </w:p>
+    <w:p>
+      <w:pPr>
+        <w:keepLines/>
+        <w:pBdr>
+          <w:top w:val="single" w:sz="4" w:space="4" w:color="C7D2E0"/>
+          <w:left w:val="single" w:sz="4" w:space="4" w:color="C7D2E0"/>
+          <w:bottom w:val="single" w:sz="4" w:space="4" w:color="C7D2E0"/>
+          <w:right w:val="single" w:sz="4" w:space="4" w:color="C7D2E0"/>
+        </w:pBdr>
+        <w:spacing w:after="200"/>
+        <w:jc w:val="center"/>
+      </w:pPr>
+      <w:r>
+        <w:rPr>
+          <w:noProof/>
+        </w:rPr>
+        <w:drawing>
+          <wp:inline distT="0" distB="0" distL="0" distR="0" wp14:anchorId="41D7EA17" wp14:editId="133C4821">
+            <wp:extent cx="5715000" cy="3095625"/>
+            <wp:effectExtent l="0" t="0" r="0" b="0"/>
+            <wp:docPr id="25729965" name="Imagen 25729965"/>
+            <wp:cNvGraphicFramePr>
+              <a:graphicFrameLocks xmlns:a="http://schemas.openxmlformats.org/drawingml/2006/main" noChangeAspect="1"/>
+            </wp:cNvGraphicFramePr>
+            <a:graphic xmlns:a="http://schemas.openxmlformats.org/drawingml/2006/main">
+              <a:graphicData uri="http://schemas.openxmlformats.org/drawingml/2006/picture">
+                <pic:pic xmlns:pic="http://schemas.openxmlformats.org/drawingml/2006/picture">
+                  <pic:nvPicPr>
+                    <pic:cNvPr id="0" name=""/>
+                    <pic:cNvPicPr>
+                      <a:picLocks noChangeAspect="1" noChangeArrowheads="1"/>
+                    </pic:cNvPicPr>
+                  </pic:nvPicPr>
+                  <pic:blipFill>
+                    <a:blip r:embed="rId6"/>
+                    <a:srcRect/>
+                    <a:stretch>
+                      <a:fillRect/>
+                    </a:stretch>
+                  </pic:blipFill>
+                  <pic:spPr bwMode="auto">
+                    <a:xfrm>
+                      <a:off x="0" y="0"/>
+                      <a:ext cx="5715000" cy="3095625"/>
+                    </a:xfrm>
+                    <a:prstGeom prst="rect">
+                      <a:avLst/>
+                    </a:prstGeom>
+                  </pic:spPr>
+                </pic:pic>
+              </a:graphicData>
+            </a:graphic>
+          </wp:inline>
+        </w:drawing>
+      </w:r>
+    </w:p>
+    <w:p>
+      <w:pPr>
+        <w:keepNext/>
+        <w:keepLines/>
+        <w:spacing w:before="220" w:after="100" w:line="276" w:lineRule="auto"/>
+      </w:pPr>
+      <w:r>
+        <w:rPr>
+          <w:b/>
+          <w:bCs/>
+          <w:color w:val="1E3A8A"/>
+        </w:rPr>
+        <w:t xml:space="preserve">Figura 3 — Validación de negocio. </w:t>
+      </w:r>
+      <w:r>
+        <w:t>Al intentar crear una transacción con monto -5000 el sistema la rechaza con un mensaje claro y la tabla no cambia. Es el mismo blindaje del encapsulamiento de la Semana 3, ahora aplicado en el controlador con try/except.</w:t>
+      </w:r>
+    </w:p>
+    <w:p>
+      <w:pPr>
+        <w:keepLines/>
+        <w:pBdr>
+          <w:top w:val="single" w:sz="4" w:space="4" w:color="C7D2E0"/>
+          <w:left w:val="single" w:sz="4" w:space="4" w:color="C7D2E0"/>
+          <w:bottom w:val="single" w:sz="4" w:space="4" w:color="C7D2E0"/>
+          <w:right w:val="single" w:sz="4" w:space="4" w:color="C7D2E0"/>
+        </w:pBdr>
+        <w:spacing w:after="200"/>
+        <w:jc w:val="center"/>
+      </w:pPr>
+      <w:r>
+        <w:rPr>
+          <w:noProof/>
+        </w:rPr>
+        <w:drawing>
+          <wp:inline distT="0" distB="0" distL="0" distR="0" wp14:anchorId="0AA7D051" wp14:editId="62EF5AFC">
+            <wp:extent cx="5715000" cy="2857500"/>
+            <wp:effectExtent l="0" t="0" r="0" b="0"/>
+            <wp:docPr id="271484528" name="Imagen 271484528"/>
+            <wp:cNvGraphicFramePr>
+              <a:graphicFrameLocks xmlns:a="http://schemas.openxmlformats.org/drawingml/2006/main" noChangeAspect="1"/>
+            </wp:cNvGraphicFramePr>
+            <a:graphic xmlns:a="http://schemas.openxmlformats.org/drawingml/2006/main">
+              <a:graphicData uri="http://schemas.openxmlformats.org/drawingml/2006/picture">
+                <pic:pic xmlns:pic="http://schemas.openxmlformats.org/drawingml/2006/picture">
+                  <pic:nvPicPr>
+                    <pic:cNvPr id="0" name=""/>
+                    <pic:cNvPicPr>
+                      <a:picLocks noChangeAspect="1" noChangeArrowheads="1"/>
+                    </pic:cNvPicPr>
+                  </pic:nvPicPr>
+                  <pic:blipFill>
+                    <a:blip r:embed="rId7"/>
+                    <a:srcRect/>
+                    <a:stretch>
+                      <a:fillRect/>
+                    </a:stretch>
+                  </pic:blipFill>
+                  <pic:spPr bwMode="auto">
+                    <a:xfrm>
+                      <a:off x="0" y="0"/>
+                      <a:ext cx="5715000" cy="2857500"/>
+                    </a:xfrm>
+                    <a:prstGeom prst="rect">
+                      <a:avLst/>
+                    </a:prstGeom>
+                  </pic:spPr>
+                </pic:pic>
+              </a:graphicData>
+            </a:graphic>
+          </wp:inline>
+        </w:drawing>
+      </w:r>
+    </w:p>
+    <w:p>
+      <w:pPr>
+        <w:keepNext/>
+        <w:keepLines/>
+        <w:spacing w:before="220" w:after="100" w:line="276" w:lineRule="auto"/>
+      </w:pPr>
+      <w:r>
+        <w:rPr>
+          <w:b/>
+          <w:bCs/>
+          <w:color w:val="1E3A8A"/>
+        </w:rPr>
+        <w:t xml:space="preserve">Figura 4 — Base de datos en Docker. </w:t>
+      </w:r>
+      <w:r>
+        <w:t>El contenedor empresa corriendo con la imagen mysql:8 y el puerto 3306 publicado. La base de datos no está instalada en el sistema operativo.</w:t>
+      </w:r>
+    </w:p>
+    <w:p>
+      <w:pPr>
+        <w:keepLines/>
+        <w:pBdr>
+          <w:top w:val="single" w:sz="4" w:space="4" w:color="C7D2E0"/>
+          <w:left w:val="single" w:sz="4" w:space="4" w:color="C7D2E0"/>
+          <w:bottom w:val="single" w:sz="4" w:space="4" w:color="C7D2E0"/>
+          <w:right w:val="single" w:sz="4" w:space="4" w:color="C7D2E0"/>
+        </w:pBdr>
+        <w:spacing w:after="200"/>
+        <w:jc w:val="center"/>
+      </w:pPr>
+      <w:r>
+        <w:rPr>
+          <w:noProof/>
+        </w:rPr>
+        <w:drawing>
+          <wp:inline distT="0" distB="0" distL="0" distR="0" wp14:anchorId="13827228" wp14:editId="0E621EA2">
+            <wp:extent cx="5715000" cy="3028950"/>
+            <wp:effectExtent l="0" t="0" r="0" b="0"/>
+            <wp:docPr id="768397378" name="Imagen 768397378"/>
+            <wp:cNvGraphicFramePr>
+              <a:graphicFrameLocks xmlns:a="http://schemas.openxmlformats.org/drawingml/2006/main" noChangeAspect="1"/>
+            </wp:cNvGraphicFramePr>
+            <a:graphic xmlns:a="http://schemas.openxmlformats.org/drawingml/2006/main">
+              <a:graphicData uri="http://schemas.openxmlformats.org/drawingml/2006/picture">
+                <pic:pic xmlns:pic="http://schemas.openxmlformats.org/drawingml/2006/picture">
+                  <pic:nvPicPr>
+                    <pic:cNvPr id="0" name=""/>
+                    <pic:cNvPicPr>
+                      <a:picLocks noChangeAspect="1" noChangeArrowheads="1"/>
+                    </pic:cNvPicPr>
+                  </pic:nvPicPr>
+                  <pic:blipFill>
+                    <a:blip r:embed="rId8"/>
+                    <a:srcRect/>
+                    <a:stretch>
+                      <a:fillRect/>
+                    </a:stretch>
+                  </pic:blipFill>
+                  <pic:spPr bwMode="auto">
+                    <a:xfrm>
+                      <a:off x="0" y="0"/>
+                      <a:ext cx="5715000" cy="3028950"/>
+                    </a:xfrm>
+                    <a:prstGeom prst="rect">
+                      <a:avLst/>
+                    </a:prstGeom>
+                  </pic:spPr>
+                </pic:pic>
+              </a:graphicData>
+            </a:graphic>
+          </wp:inline>
+        </w:drawing>
+      </w:r>
+    </w:p>
+    <w:p>
+      <w:pPr>
+        <w:keepNext/>
+        <w:keepLines/>
+        <w:spacing w:before="220" w:after="100" w:line="276" w:lineRule="auto"/>
+      </w:pPr>
+      <w:r>
+        <w:rPr>
+          <w:b/>
+          <w:bCs/>
+          <w:color w:val="1E3A8A"/>
+        </w:rPr>
+        <w:t xml:space="preserve">Figura 5 — Persistencia. </w:t>
+      </w:r>
+      <w:r>
+        <w:t>Tras crear la transacción T005 y recargar la página con F5, el registro sigue presente: los datos viven en MySQL, no en la memoria del navegador.</w:t>
+      </w:r>
+    </w:p>
+    <w:p>
+      <w:pPr>
+        <w:keepLines/>
+        <w:pBdr>
+          <w:top w:val="single" w:sz="4" w:space="4" w:color="C7D2E0"/>
+          <w:left w:val="single" w:sz="4" w:space="4" w:color="C7D2E0"/>
+          <w:bottom w:val="single" w:sz="4" w:space="4" w:color="C7D2E0"/>
+          <w:right w:val="single" w:sz="4" w:space="4" w:color="C7D2E0"/>
+        </w:pBdr>
+        <w:spacing w:after="200"/>
+        <w:jc w:val="center"/>
+      </w:pPr>
+      <w:r>
+        <w:rPr>
+          <w:noProof/>
+        </w:rPr>
+        <w:drawing>
+          <wp:inline distT="0" distB="0" distL="0" distR="0" wp14:anchorId="653DE5DF" wp14:editId="12A87E9F">
+            <wp:extent cx="5715000" cy="2857500"/>
+            <wp:effectExtent l="0" t="0" r="0" b="0"/>
+            <wp:docPr id="826247615" name="Imagen 826247615"/>
+            <wp:cNvGraphicFramePr>
+              <a:graphicFrameLocks xmlns:a="http://schemas.openxmlformats.org/drawingml/2006/main" noChangeAspect="1"/>
+            </wp:cNvGraphicFramePr>
+            <a:graphic xmlns:a="http://schemas.openxmlformats.org/drawingml/2006/main">
+              <a:graphicData uri="http://schemas.openxmlformats.org/drawingml/2006/picture">
+                <pic:pic xmlns:pic="http://schemas.openxmlformats.org/drawingml/2006/picture">
+                  <pic:nvPicPr>
+                    <pic:cNvPr id="0" name=""/>
+                    <pic:cNvPicPr>
+                      <a:picLocks noChangeAspect="1" noChangeArrowheads="1"/>
+                    </pic:cNvPicPr>
+                  </pic:nvPicPr>
+                  <pic:blipFill>
+                    <a:blip r:embed="rId9"/>
+                    <a:srcRect/>
+                    <a:stretch>
+                      <a:fillRect/>
+                    </a:stretch>
+                  </pic:blipFill>
+                  <pic:spPr bwMode="auto">
+                    <a:xfrm>
+                      <a:off x="0" y="0"/>
+                      <a:ext cx="5715000" cy="2857500"/>
+                    </a:xfrm>
+                    <a:prstGeom prst="rect">
+                      <a:avLst/>
+                    </a:prstGeom>
+                  </pic:spPr>
+                </pic:pic>
+              </a:graphicData>
+            </a:graphic>
+          </wp:inline>
+        </w:drawing>
       </w:r>
     </w:p>
     <w:p>
@@ -6855,7 +7378,7 @@
         </w:pBdr>
         <w:spacing w:before="360" w:after="160"/>
       </w:pPr>
-      <w:bookmarkStart w:id="17" w:name="_Toc236584362"/>
+      <w:bookmarkStart w:id="18" w:name="_Toc236586604"/>
       <w:r>
         <w:rPr>
           <w:b/>
@@ -6866,7 +7389,7 @@
         </w:rPr>
         <w:t>8. Trazabilidad con el curso</w:t>
       </w:r>
-      <w:bookmarkEnd w:id="17"/>
+      <w:bookmarkEnd w:id="18"/>
     </w:p>
     <w:tbl>
       <w:tblPr>
@@ -6883,7 +7406,7 @@
           <w:left w:w="10" w:type="dxa"/>
           <w:right w:w="10" w:type="dxa"/>
         </w:tblCellMar>
-        <w:tblLook w:val="04A0" w:firstRow="1" w:lastRow="0" w:firstColumn="1" w:lastColumn="0" w:noHBand="0" w:noVBand="1"/>
+        <w:tblLook w:val="0000" w:firstRow="0" w:lastRow="0" w:firstColumn="0" w:lastColumn="0" w:noHBand="0" w:noVBand="0"/>
       </w:tblPr>
       <w:tblGrid>
         <w:gridCol w:w="1030"/>
@@ -7559,7 +8082,7 @@
         </w:pBdr>
         <w:spacing w:before="360" w:after="160"/>
       </w:pPr>
-      <w:bookmarkStart w:id="18" w:name="_Toc236584363"/>
+      <w:bookmarkStart w:id="19" w:name="_Toc236586605"/>
       <w:r>
         <w:rPr>
           <w:b/>
@@ -7570,7 +8093,7 @@
         </w:rPr>
         <w:t>9. Conclusiones</w:t>
       </w:r>
-      <w:bookmarkEnd w:id="18"/>
+      <w:bookmarkEnd w:id="19"/>
     </w:p>
     <w:p>
       <w:pPr>
@@ -7637,10 +8160,10 @@
 <file path=word/numbering.xml><?xml version="1.0" encoding="utf-8"?>
 <w:numbering xmlns:wpc="http://schemas.microsoft.com/office/word/2010/wordprocessingCanvas" xmlns:cx="http://schemas.microsoft.com/office/drawing/2014/chartex" xmlns:cx1="http://schemas.microsoft.com/office/drawing/2015/9/8/chartex" xmlns:cx2="http://schemas.microsoft.com/office/drawing/2015/10/21/chartex" xmlns:cx3="http://schemas.microsoft.com/office/drawing/2016/5/9/chartex" xmlns:cx4="http://schemas.microsoft.com/office/drawing/2016/5/10/chartex" xmlns:cx5="http://schemas.microsoft.com/office/drawing/2016/5/11/chartex" xmlns:cx6="http://schemas.microsoft.com/office/drawing/2016/5/12/chartex" xmlns:cx7="http://schemas.microsoft.com/office/drawing/2016/5/13/chartex" xmlns:cx8="http://schemas.microsoft.com/office/drawing/2016/5/14/chartex" xmlns:mc="http://schemas.openxmlformats.org/markup-compatibility/2006" xmlns:aink="http://schemas.microsoft.com/office/drawing/2016/ink" xmlns:am3d="http://schemas.microsoft.com/office/drawing/2017/model3d" xmlns:o="urn:schemas-microsoft-com:office:office" xmlns:oel="http://schemas.microsoft.com/office/2019/extlst" xmlns:r="http://schemas.openxmlformats.org/officeDocument/2006/relationships" xmlns:m="http://schemas.openxmlformats.org/officeDocument/2006/math" xmlns:v="urn:schemas-microsoft-com:vml" xmlns:wp14="http://schemas.microsoft.com/office/word/2010/wordprocessingDrawing" xmlns:wp="http://schemas.openxmlformats.org/drawingml/2006/wordprocessingDrawing" xmlns:w10="urn:schemas-microsoft-com:office:word" xmlns:w="http://schemas.openxmlformats.org/wordprocessingml/2006/main" xmlns:w14="http://schemas.microsoft.com/office/word/2010/wordml" xmlns:w15="http://schemas.microsoft.com/office/word/2012/wordml" xmlns:w16cei="http://schemas.microsoft.com/office/word/2026/wordml/cei" xmlns:w16cex="http://schemas.microsoft.com/office/word/2018/wordml/cex" xmlns:w16cid="http://schemas.microsoft.com/office/word/2016/wordml/cid" xmlns:w16="http://schemas.microsoft.com/office/word/2018/wordml" xmlns:w16du="http://schemas.microsoft.com/office/word/2023/wordml/word16du" xmlns:w16sdtdh="http://schemas.microsoft.com/office/word/2020/wordml/sdtdatahash" xmlns:w16sdtfl="http://schemas.microsoft.com/office/word/2024/wordml/sdtformatlock" xmlns:w16se="http://schemas.microsoft.com/office/word/2015/wordml/symex" xmlns:wpg="http://schemas.microsoft.com/office/word/2010/wordprocessingGroup" xmlns:wpi="http://schemas.microsoft.com/office/word/2010/wordprocessingInk" xmlns:wne="http://schemas.microsoft.com/office/word/2006/wordml" xmlns:wps="http://schemas.microsoft.com/office/word/2010/wordprocessingShape" mc:Ignorable="w14 w15 w16se w16cid w16 w16cex w16sdtdh w16sdtfl w16du wp14">
   <w:abstractNum w:abstractNumId="0" w15:restartNumberingAfterBreak="0">
-    <w:nsid w:val="170E3162"/>
+    <w:nsid w:val="02A23EAE"/>
     <w:multiLevelType w:val="hybridMultilevel"/>
-    <w:tmpl w:val="51B052B4"/>
-    <w:lvl w:ilvl="0" w:tplc="139A6E82">
+    <w:tmpl w:val="A0C4FD20"/>
+    <w:lvl w:ilvl="0" w:tplc="7C3C7A8E">
       <w:start w:val="1"/>
       <w:numFmt w:val="decimal"/>
       <w:lvlText w:val="%1."/>
@@ -7649,52 +8172,52 @@
         <w:ind w:left="460" w:hanging="260"/>
       </w:pPr>
     </w:lvl>
-    <w:lvl w:ilvl="1" w:tplc="0D468C50">
+    <w:lvl w:ilvl="1" w:tplc="09B250D0">
       <w:numFmt w:val="decimal"/>
       <w:lvlText w:val=""/>
       <w:lvlJc w:val="left"/>
     </w:lvl>
-    <w:lvl w:ilvl="2" w:tplc="830012C4">
+    <w:lvl w:ilvl="2" w:tplc="AEF81146">
       <w:numFmt w:val="decimal"/>
       <w:lvlText w:val=""/>
       <w:lvlJc w:val="left"/>
     </w:lvl>
-    <w:lvl w:ilvl="3" w:tplc="4C6C4632">
+    <w:lvl w:ilvl="3" w:tplc="FA24C9BC">
       <w:numFmt w:val="decimal"/>
       <w:lvlText w:val=""/>
       <w:lvlJc w:val="left"/>
     </w:lvl>
-    <w:lvl w:ilvl="4" w:tplc="7408BB16">
+    <w:lvl w:ilvl="4" w:tplc="A81266EA">
       <w:numFmt w:val="decimal"/>
       <w:lvlText w:val=""/>
       <w:lvlJc w:val="left"/>
     </w:lvl>
-    <w:lvl w:ilvl="5" w:tplc="F24CE65C">
+    <w:lvl w:ilvl="5" w:tplc="9B246292">
       <w:numFmt w:val="decimal"/>
       <w:lvlText w:val=""/>
       <w:lvlJc w:val="left"/>
     </w:lvl>
-    <w:lvl w:ilvl="6" w:tplc="DADCAB3E">
+    <w:lvl w:ilvl="6" w:tplc="DDD49BEE">
       <w:numFmt w:val="decimal"/>
       <w:lvlText w:val=""/>
       <w:lvlJc w:val="left"/>
     </w:lvl>
-    <w:lvl w:ilvl="7" w:tplc="EFAADD5A">
+    <w:lvl w:ilvl="7" w:tplc="8B2CAC2E">
       <w:numFmt w:val="decimal"/>
       <w:lvlText w:val=""/>
       <w:lvlJc w:val="left"/>
     </w:lvl>
-    <w:lvl w:ilvl="8" w:tplc="6F42C81C">
+    <w:lvl w:ilvl="8" w:tplc="063EF4E6">
       <w:numFmt w:val="decimal"/>
       <w:lvlText w:val=""/>
       <w:lvlJc w:val="left"/>
     </w:lvl>
   </w:abstractNum>
   <w:abstractNum w:abstractNumId="1" w15:restartNumberingAfterBreak="0">
-    <w:nsid w:val="4A143337"/>
+    <w:nsid w:val="04B826BD"/>
     <w:multiLevelType w:val="hybridMultilevel"/>
-    <w:tmpl w:val="5C3A76BE"/>
-    <w:lvl w:ilvl="0" w:tplc="C3A061C2">
+    <w:tmpl w:val="E48A3D84"/>
+    <w:lvl w:ilvl="0" w:tplc="6BF6458C">
       <w:start w:val="1"/>
       <w:numFmt w:val="bullet"/>
       <w:lvlText w:val="●"/>
@@ -7703,7 +8226,7 @@
         <w:ind w:left="720" w:hanging="360"/>
       </w:pPr>
     </w:lvl>
-    <w:lvl w:ilvl="1" w:tplc="CB3A032C">
+    <w:lvl w:ilvl="1" w:tplc="65A62386">
       <w:start w:val="1"/>
       <w:numFmt w:val="bullet"/>
       <w:lvlText w:val="○"/>
@@ -7712,7 +8235,7 @@
         <w:ind w:left="1440" w:hanging="360"/>
       </w:pPr>
     </w:lvl>
-    <w:lvl w:ilvl="2" w:tplc="29F03DB0">
+    <w:lvl w:ilvl="2" w:tplc="4A32EE54">
       <w:start w:val="1"/>
       <w:numFmt w:val="bullet"/>
       <w:lvlText w:val="■"/>
@@ -7721,7 +8244,7 @@
         <w:ind w:left="2160" w:hanging="360"/>
       </w:pPr>
     </w:lvl>
-    <w:lvl w:ilvl="3" w:tplc="FD8A5AFC">
+    <w:lvl w:ilvl="3" w:tplc="D2EE7CD0">
       <w:start w:val="1"/>
       <w:numFmt w:val="bullet"/>
       <w:lvlText w:val="●"/>
@@ -7730,7 +8253,7 @@
         <w:ind w:left="2880" w:hanging="360"/>
       </w:pPr>
     </w:lvl>
-    <w:lvl w:ilvl="4" w:tplc="F09C59B6">
+    <w:lvl w:ilvl="4" w:tplc="DB283FFE">
       <w:start w:val="1"/>
       <w:numFmt w:val="bullet"/>
       <w:lvlText w:val="○"/>
@@ -7739,7 +8262,7 @@
         <w:ind w:left="3600" w:hanging="360"/>
       </w:pPr>
     </w:lvl>
-    <w:lvl w:ilvl="5" w:tplc="19D8FCC8">
+    <w:lvl w:ilvl="5" w:tplc="4572AFFE">
       <w:start w:val="1"/>
       <w:numFmt w:val="bullet"/>
       <w:lvlText w:val="■"/>
@@ -7748,7 +8271,7 @@
         <w:ind w:left="4320" w:hanging="360"/>
       </w:pPr>
     </w:lvl>
-    <w:lvl w:ilvl="6" w:tplc="25465F42">
+    <w:lvl w:ilvl="6" w:tplc="3806B562">
       <w:start w:val="1"/>
       <w:numFmt w:val="bullet"/>
       <w:lvlText w:val="●"/>
@@ -7757,7 +8280,7 @@
         <w:ind w:left="5040" w:hanging="360"/>
       </w:pPr>
     </w:lvl>
-    <w:lvl w:ilvl="7" w:tplc="027CC096">
+    <w:lvl w:ilvl="7" w:tplc="171862A2">
       <w:start w:val="1"/>
       <w:numFmt w:val="bullet"/>
       <w:lvlText w:val="●"/>
@@ -7766,7 +8289,7 @@
         <w:ind w:left="5760" w:hanging="360"/>
       </w:pPr>
     </w:lvl>
-    <w:lvl w:ilvl="8" w:tplc="CF104AD4">
+    <w:lvl w:ilvl="8" w:tplc="4A0E896E">
       <w:start w:val="1"/>
       <w:numFmt w:val="bullet"/>
       <w:lvlText w:val="●"/>
@@ -7777,10 +8300,10 @@
     </w:lvl>
   </w:abstractNum>
   <w:abstractNum w:abstractNumId="2" w15:restartNumberingAfterBreak="0">
-    <w:nsid w:val="4B7C2A35"/>
+    <w:nsid w:val="7FAC2F41"/>
     <w:multiLevelType w:val="hybridMultilevel"/>
-    <w:tmpl w:val="D0BA09BA"/>
-    <w:lvl w:ilvl="0" w:tplc="A72CE7EC">
+    <w:tmpl w:val="F758A9D6"/>
+    <w:lvl w:ilvl="0" w:tplc="F272C72A">
       <w:start w:val="1"/>
       <w:numFmt w:val="bullet"/>
       <w:lvlText w:val="•"/>
@@ -7789,7 +8312,7 @@
         <w:ind w:left="460" w:hanging="260"/>
       </w:pPr>
     </w:lvl>
-    <w:lvl w:ilvl="1" w:tplc="FF34FC90">
+    <w:lvl w:ilvl="1" w:tplc="3B245818">
       <w:start w:val="1"/>
       <w:numFmt w:val="bullet"/>
       <w:lvlText w:val="◦"/>
@@ -7798,55 +8321,55 @@
         <w:ind w:left="900" w:hanging="260"/>
       </w:pPr>
     </w:lvl>
-    <w:lvl w:ilvl="2" w:tplc="A6521748">
+    <w:lvl w:ilvl="2" w:tplc="0018D658">
       <w:numFmt w:val="decimal"/>
       <w:lvlText w:val=""/>
       <w:lvlJc w:val="left"/>
     </w:lvl>
-    <w:lvl w:ilvl="3" w:tplc="936AD3F4">
+    <w:lvl w:ilvl="3" w:tplc="9126D9FC">
       <w:numFmt w:val="decimal"/>
       <w:lvlText w:val=""/>
       <w:lvlJc w:val="left"/>
     </w:lvl>
-    <w:lvl w:ilvl="4" w:tplc="EB409B20">
+    <w:lvl w:ilvl="4" w:tplc="561CF7F8">
       <w:numFmt w:val="decimal"/>
       <w:lvlText w:val=""/>
       <w:lvlJc w:val="left"/>
     </w:lvl>
-    <w:lvl w:ilvl="5" w:tplc="A7805E1E">
+    <w:lvl w:ilvl="5" w:tplc="70E8CD08">
       <w:numFmt w:val="decimal"/>
       <w:lvlText w:val=""/>
       <w:lvlJc w:val="left"/>
     </w:lvl>
-    <w:lvl w:ilvl="6" w:tplc="2526AAC0">
+    <w:lvl w:ilvl="6" w:tplc="33A835D6">
       <w:numFmt w:val="decimal"/>
       <w:lvlText w:val=""/>
       <w:lvlJc w:val="left"/>
     </w:lvl>
-    <w:lvl w:ilvl="7" w:tplc="FF10C4B2">
+    <w:lvl w:ilvl="7" w:tplc="E1A890EC">
       <w:numFmt w:val="decimal"/>
       <w:lvlText w:val=""/>
       <w:lvlJc w:val="left"/>
     </w:lvl>
-    <w:lvl w:ilvl="8" w:tplc="6136CD68">
+    <w:lvl w:ilvl="8" w:tplc="4A50443A">
       <w:numFmt w:val="decimal"/>
       <w:lvlText w:val=""/>
       <w:lvlJc w:val="left"/>
     </w:lvl>
   </w:abstractNum>
-  <w:num w:numId="1" w16cid:durableId="1736513399">
+  <w:num w:numId="1" w16cid:durableId="1290477554">
     <w:abstractNumId w:val="1"/>
     <w:lvlOverride w:ilvl="0">
       <w:startOverride w:val="1"/>
     </w:lvlOverride>
   </w:num>
-  <w:num w:numId="2" w16cid:durableId="1668098029">
+  <w:num w:numId="2" w16cid:durableId="1567837214">
     <w:abstractNumId w:val="2"/>
     <w:lvlOverride w:ilvl="0">
       <w:startOverride w:val="1"/>
     </w:lvlOverride>
   </w:num>
-  <w:num w:numId="3" w16cid:durableId="296297906">
+  <w:num w:numId="3" w16cid:durableId="2117866358">
     <w:abstractNumId w:val="0"/>
     <w:lvlOverride w:ilvl="0">
       <w:startOverride w:val="1"/>
@@ -8459,7 +8982,7 @@
     <w:autoRedefine/>
     <w:uiPriority w:val="39"/>
     <w:unhideWhenUsed/>
-    <w:rsid w:val="00991832"/>
+    <w:rsid w:val="0011748A"/>
     <w:pPr>
       <w:spacing w:after="100"/>
     </w:pPr>
@@ -8471,7 +8994,7 @@
     <w:autoRedefine/>
     <w:uiPriority w:val="39"/>
     <w:unhideWhenUsed/>
-    <w:rsid w:val="00991832"/>
+    <w:rsid w:val="0011748A"/>
     <w:pPr>
       <w:spacing w:after="100"/>
       <w:ind w:left="220"/>

</xml_diff>